<commit_message>
sql till 15 sept
</commit_message>
<xml_diff>
--- a/QS SQL/SQL Class Notes.docx
+++ b/QS SQL/SQL Class Notes.docx
@@ -7617,7 +7617,21 @@
         <w:rPr>
           <w:sz w:val="22"/>
         </w:rPr>
-        <w:t>SELECT * [DISTINCT] column_name | expression [AS alias]</w:t>
+        <w:t xml:space="preserve">SELECT * [DISTINCT] </w:t>
+      </w:r>
+      <w:proofErr w:type="spellStart"/>
+      <w:r>
+        <w:rPr>
+          <w:sz w:val="22"/>
+        </w:rPr>
+        <w:t>column_name</w:t>
+      </w:r>
+      <w:proofErr w:type="spellEnd"/>
+      <w:r>
+        <w:rPr>
+          <w:sz w:val="22"/>
+        </w:rPr>
+        <w:t xml:space="preserve"> | expression [AS alias]</w:t>
       </w:r>
     </w:p>
     <w:p>
@@ -7630,8 +7644,16 @@
         <w:rPr>
           <w:rFonts w:ascii="Consolas" w:hAnsi="Consolas"/>
         </w:rPr>
-        <w:t>FROM table_name</w:t>
-      </w:r>
+        <w:t xml:space="preserve">FROM </w:t>
+      </w:r>
+      <w:proofErr w:type="spellStart"/>
+      <w:r>
+        <w:rPr>
+          <w:rFonts w:ascii="Consolas" w:hAnsi="Consolas"/>
+        </w:rPr>
+        <w:t>table_name</w:t>
+      </w:r>
+      <w:proofErr w:type="spellEnd"/>
     </w:p>
     <w:p>
       <w:pPr>
@@ -9013,11 +9035,19 @@
           <w:rStyle w:val="HTMLCode"/>
         </w:rPr>
       </w:pPr>
+      <w:proofErr w:type="spellStart"/>
       <w:r>
         <w:rPr>
           <w:rStyle w:val="HTMLCode"/>
         </w:rPr>
-        <w:t>Col_Name IN (val1, val2, val3</w:t>
+        <w:t>Col_Name</w:t>
+      </w:r>
+      <w:proofErr w:type="spellEnd"/>
+      <w:r>
+        <w:rPr>
+          <w:rStyle w:val="HTMLCode"/>
+        </w:rPr>
+        <w:t xml:space="preserve"> IN (val1, val2, val3</w:t>
       </w:r>
       <w:proofErr w:type="gramStart"/>
       <w:r>
@@ -9130,11 +9160,19 @@
           <w:rStyle w:val="HTMLCode"/>
         </w:rPr>
       </w:pPr>
+      <w:proofErr w:type="spellStart"/>
       <w:r>
         <w:rPr>
           <w:rStyle w:val="HTMLCode"/>
         </w:rPr>
-        <w:t>Col_Name NOT IN (val1, val2, val3</w:t>
+        <w:t>Col_Name</w:t>
+      </w:r>
+      <w:proofErr w:type="spellEnd"/>
+      <w:r>
+        <w:rPr>
+          <w:rStyle w:val="HTMLCode"/>
+        </w:rPr>
+        <w:t xml:space="preserve"> NOT IN (val1, val2, val3</w:t>
       </w:r>
       <w:proofErr w:type="gramStart"/>
       <w:r>
@@ -9220,18 +9258,54 @@
           <w:rStyle w:val="HTMLCode"/>
         </w:rPr>
       </w:pPr>
+      <w:proofErr w:type="spellStart"/>
       <w:r>
         <w:rPr>
           <w:rStyle w:val="HTMLCode"/>
         </w:rPr>
-        <w:t>Col_Name BETWEEN lower_value AND higher_</w:t>
+        <w:t>Col_Name</w:t>
+      </w:r>
+      <w:proofErr w:type="spellEnd"/>
+      <w:r>
+        <w:rPr>
+          <w:rStyle w:val="HTMLCode"/>
+        </w:rPr>
+        <w:t xml:space="preserve"> BETWEEN </w:t>
+      </w:r>
+      <w:proofErr w:type="spellStart"/>
+      <w:r>
+        <w:rPr>
+          <w:rStyle w:val="HTMLCode"/>
+        </w:rPr>
+        <w:t>lower_value</w:t>
+      </w:r>
+      <w:proofErr w:type="spellEnd"/>
+      <w:r>
+        <w:rPr>
+          <w:rStyle w:val="HTMLCode"/>
+        </w:rPr>
+        <w:t xml:space="preserve"> AND </w:t>
+      </w:r>
+      <w:proofErr w:type="spellStart"/>
+      <w:r>
+        <w:rPr>
+          <w:rStyle w:val="HTMLCode"/>
+        </w:rPr>
+        <w:t>higher_</w:t>
       </w:r>
       <w:proofErr w:type="gramStart"/>
       <w:r>
         <w:rPr>
           <w:rStyle w:val="HTMLCode"/>
         </w:rPr>
-        <w:t>value;</w:t>
+        <w:t>value</w:t>
+      </w:r>
+      <w:proofErr w:type="spellEnd"/>
+      <w:r>
+        <w:rPr>
+          <w:rStyle w:val="HTMLCode"/>
+        </w:rPr>
+        <w:t>;</w:t>
       </w:r>
       <w:proofErr w:type="gramEnd"/>
     </w:p>
@@ -9404,18 +9478,54 @@
       <w:pPr>
         <w:pStyle w:val="HTMLPreformatted"/>
       </w:pPr>
+      <w:proofErr w:type="spellStart"/>
       <w:r>
         <w:rPr>
           <w:rStyle w:val="HTMLCode"/>
         </w:rPr>
-        <w:t>Col_Name NOT BETWEEN lower_value AND higher_</w:t>
+        <w:t>Col_Name</w:t>
+      </w:r>
+      <w:proofErr w:type="spellEnd"/>
+      <w:r>
+        <w:rPr>
+          <w:rStyle w:val="HTMLCode"/>
+        </w:rPr>
+        <w:t xml:space="preserve"> NOT BETWEEN </w:t>
+      </w:r>
+      <w:proofErr w:type="spellStart"/>
+      <w:r>
+        <w:rPr>
+          <w:rStyle w:val="HTMLCode"/>
+        </w:rPr>
+        <w:t>lower_value</w:t>
+      </w:r>
+      <w:proofErr w:type="spellEnd"/>
+      <w:r>
+        <w:rPr>
+          <w:rStyle w:val="HTMLCode"/>
+        </w:rPr>
+        <w:t xml:space="preserve"> AND </w:t>
+      </w:r>
+      <w:proofErr w:type="spellStart"/>
+      <w:r>
+        <w:rPr>
+          <w:rStyle w:val="HTMLCode"/>
+        </w:rPr>
+        <w:t>higher_</w:t>
       </w:r>
       <w:proofErr w:type="gramStart"/>
       <w:r>
         <w:rPr>
           <w:rStyle w:val="HTMLCode"/>
         </w:rPr>
-        <w:t>value;</w:t>
+        <w:t>value</w:t>
+      </w:r>
+      <w:proofErr w:type="spellEnd"/>
+      <w:r>
+        <w:rPr>
+          <w:rStyle w:val="HTMLCode"/>
+        </w:rPr>
+        <w:t>;</w:t>
       </w:r>
       <w:proofErr w:type="gramEnd"/>
     </w:p>
@@ -9513,11 +9623,19 @@
           <w:rStyle w:val="HTMLCode"/>
         </w:rPr>
       </w:pPr>
+      <w:proofErr w:type="spellStart"/>
       <w:r>
         <w:rPr>
           <w:rStyle w:val="HTMLCode"/>
         </w:rPr>
-        <w:t xml:space="preserve">Col_Name IS </w:t>
+        <w:t>Col_Name</w:t>
+      </w:r>
+      <w:proofErr w:type="spellEnd"/>
+      <w:r>
+        <w:rPr>
+          <w:rStyle w:val="HTMLCode"/>
+        </w:rPr>
+        <w:t xml:space="preserve"> IS </w:t>
       </w:r>
       <w:proofErr w:type="gramStart"/>
       <w:r>
@@ -9576,11 +9694,19 @@
           <w:rStyle w:val="HTMLCode"/>
         </w:rPr>
       </w:pPr>
+      <w:proofErr w:type="spellStart"/>
       <w:r>
         <w:rPr>
           <w:rStyle w:val="HTMLCode"/>
         </w:rPr>
-        <w:t xml:space="preserve">Col_Name IS NOT </w:t>
+        <w:t>Col_Name</w:t>
+      </w:r>
+      <w:proofErr w:type="spellEnd"/>
+      <w:r>
+        <w:rPr>
+          <w:rStyle w:val="HTMLCode"/>
+        </w:rPr>
+        <w:t xml:space="preserve"> IS NOT </w:t>
       </w:r>
       <w:proofErr w:type="gramStart"/>
       <w:r>
@@ -9643,11 +9769,19 @@
           <w:rStyle w:val="HTMLCode"/>
         </w:rPr>
       </w:pPr>
+      <w:proofErr w:type="spellStart"/>
       <w:r>
         <w:rPr>
           <w:rStyle w:val="HTMLCode"/>
         </w:rPr>
-        <w:t>Col_Name LIKE 'pattern</w:t>
+        <w:t>Col_Name</w:t>
+      </w:r>
+      <w:proofErr w:type="spellEnd"/>
+      <w:r>
+        <w:rPr>
+          <w:rStyle w:val="HTMLCode"/>
+        </w:rPr>
+        <w:t xml:space="preserve"> LIKE 'pattern</w:t>
       </w:r>
       <w:proofErr w:type="gramStart"/>
       <w:r>
@@ -9891,11 +10025,19 @@
           <w:rStyle w:val="HTMLCode"/>
         </w:rPr>
       </w:pPr>
+      <w:proofErr w:type="spellStart"/>
       <w:r>
         <w:rPr>
           <w:rStyle w:val="HTMLCode"/>
         </w:rPr>
-        <w:t>Col_Name NOT LIKE 'pattern</w:t>
+        <w:t>Col_Name</w:t>
+      </w:r>
+      <w:proofErr w:type="spellEnd"/>
+      <w:r>
+        <w:rPr>
+          <w:rStyle w:val="HTMLCode"/>
+        </w:rPr>
+        <w:t xml:space="preserve"> NOT LIKE 'pattern</w:t>
       </w:r>
       <w:proofErr w:type="gramStart"/>
       <w:r>
@@ -10578,7 +10720,23 @@
           <w:sz w:val="28"/>
           <w:szCs w:val="28"/>
         </w:rPr>
-        <w:t xml:space="preserve"> MRF(Col_Name/Expression)</w:t>
+        <w:t xml:space="preserve"> MRF(</w:t>
+      </w:r>
+      <w:proofErr w:type="spellStart"/>
+      <w:r>
+        <w:rPr>
+          <w:sz w:val="28"/>
+          <w:szCs w:val="28"/>
+        </w:rPr>
+        <w:t>Col_Name</w:t>
+      </w:r>
+      <w:proofErr w:type="spellEnd"/>
+      <w:r>
+        <w:rPr>
+          <w:sz w:val="28"/>
+          <w:szCs w:val="28"/>
+        </w:rPr>
+        <w:t>/Expression)</w:t>
       </w:r>
       <w:r>
         <w:rPr>
@@ -10945,7 +11103,25 @@
           <w:sz w:val="28"/>
           <w:szCs w:val="28"/>
         </w:rPr>
-        <w:t>GROUP BY ColName/</w:t>
+        <w:t xml:space="preserve">GROUP BY </w:t>
+      </w:r>
+      <w:proofErr w:type="spellStart"/>
+      <w:r>
+        <w:rPr>
+          <w:rFonts w:ascii="Consolas" w:hAnsi="Consolas"/>
+          <w:sz w:val="28"/>
+          <w:szCs w:val="28"/>
+        </w:rPr>
+        <w:t>ColName</w:t>
+      </w:r>
+      <w:proofErr w:type="spellEnd"/>
+      <w:r>
+        <w:rPr>
+          <w:rFonts w:ascii="Consolas" w:hAnsi="Consolas"/>
+          <w:sz w:val="28"/>
+          <w:szCs w:val="28"/>
+        </w:rPr>
+        <w:t>/</w:t>
       </w:r>
       <w:r>
         <w:rPr>
@@ -11885,7 +12061,25 @@
           <w:sz w:val="28"/>
           <w:szCs w:val="28"/>
         </w:rPr>
-        <w:t xml:space="preserve"> Img here </w:t>
+        <w:t xml:space="preserve"> </w:t>
+      </w:r>
+      <w:proofErr w:type="spellStart"/>
+      <w:r>
+        <w:rPr>
+          <w:rFonts w:ascii="Consolas" w:hAnsi="Consolas"/>
+          <w:sz w:val="28"/>
+          <w:szCs w:val="28"/>
+        </w:rPr>
+        <w:t>Img</w:t>
+      </w:r>
+      <w:proofErr w:type="spellEnd"/>
+      <w:r>
+        <w:rPr>
+          <w:rFonts w:ascii="Consolas" w:hAnsi="Consolas"/>
+          <w:sz w:val="28"/>
+          <w:szCs w:val="28"/>
+        </w:rPr>
+        <w:t xml:space="preserve"> here </w:t>
       </w:r>
     </w:p>
     <w:p>
@@ -11978,7 +12172,25 @@
           <w:sz w:val="28"/>
           <w:szCs w:val="28"/>
         </w:rPr>
-        <w:t xml:space="preserve"> as i/p to outer</w:t>
+        <w:t xml:space="preserve"> as </w:t>
+      </w:r>
+      <w:proofErr w:type="spellStart"/>
+      <w:r>
+        <w:rPr>
+          <w:rFonts w:ascii="Consolas" w:hAnsi="Consolas"/>
+          <w:sz w:val="28"/>
+          <w:szCs w:val="28"/>
+        </w:rPr>
+        <w:t>i</w:t>
+      </w:r>
+      <w:proofErr w:type="spellEnd"/>
+      <w:r>
+        <w:rPr>
+          <w:rFonts w:ascii="Consolas" w:hAnsi="Consolas"/>
+          <w:sz w:val="28"/>
+          <w:szCs w:val="28"/>
+        </w:rPr>
+        <w:t>/p to outer</w:t>
       </w:r>
       <w:r>
         <w:rPr>
@@ -12817,6 +13029,112 @@
           <w:szCs w:val="28"/>
         </w:rPr>
         <w:t>We can nest the query up to 255 subqueries.</w:t>
+      </w:r>
+    </w:p>
+    <w:p>
+      <w:pPr>
+        <w:spacing w:line="240" w:lineRule="auto"/>
+        <w:rPr>
+          <w:sz w:val="28"/>
+          <w:szCs w:val="28"/>
+        </w:rPr>
+      </w:pPr>
+    </w:p>
+    <w:p>
+      <w:pPr>
+        <w:spacing w:line="240" w:lineRule="auto"/>
+        <w:jc w:val="center"/>
+        <w:rPr>
+          <w:b/>
+          <w:bCs/>
+          <w:sz w:val="28"/>
+          <w:szCs w:val="28"/>
+          <w:u w:val="single"/>
+        </w:rPr>
+      </w:pPr>
+      <w:r>
+        <w:rPr>
+          <w:b/>
+          <w:bCs/>
+          <w:sz w:val="28"/>
+          <w:szCs w:val="28"/>
+          <w:u w:val="single"/>
+        </w:rPr>
+        <w:t>EMPLOYEE MANAGER RELATIONSHIP</w:t>
+      </w:r>
+    </w:p>
+    <w:p>
+      <w:pPr>
+        <w:pStyle w:val="ListParagraph"/>
+        <w:numPr>
+          <w:ilvl w:val="0"/>
+          <w:numId w:val="50"/>
+        </w:numPr>
+        <w:spacing w:line="240" w:lineRule="auto"/>
+        <w:rPr>
+          <w:sz w:val="28"/>
+          <w:szCs w:val="28"/>
+        </w:rPr>
+      </w:pPr>
+      <w:r>
+        <w:rPr>
+          <w:sz w:val="28"/>
+          <w:szCs w:val="28"/>
+        </w:rPr>
+        <w:t xml:space="preserve">To find the manager the </w:t>
+      </w:r>
+      <w:proofErr w:type="spellStart"/>
+      <w:r>
+        <w:rPr>
+          <w:sz w:val="28"/>
+          <w:szCs w:val="28"/>
+        </w:rPr>
+        <w:t>mgr</w:t>
+      </w:r>
+      <w:proofErr w:type="spellEnd"/>
+      <w:r>
+        <w:rPr>
+          <w:sz w:val="28"/>
+          <w:szCs w:val="28"/>
+        </w:rPr>
+        <w:t xml:space="preserve"> should be in subquery.</w:t>
+      </w:r>
+    </w:p>
+    <w:p>
+      <w:pPr>
+        <w:pStyle w:val="ListParagraph"/>
+        <w:numPr>
+          <w:ilvl w:val="0"/>
+          <w:numId w:val="50"/>
+        </w:numPr>
+        <w:spacing w:line="240" w:lineRule="auto"/>
+        <w:rPr>
+          <w:sz w:val="28"/>
+          <w:szCs w:val="28"/>
+        </w:rPr>
+      </w:pPr>
+      <w:r>
+        <w:rPr>
+          <w:sz w:val="28"/>
+          <w:szCs w:val="28"/>
+        </w:rPr>
+        <w:t>To find the employee, the em</w:t>
+      </w:r>
+      <w:proofErr w:type="spellStart"/>
+      <w:r>
+        <w:rPr>
+          <w:sz w:val="28"/>
+          <w:szCs w:val="28"/>
+        </w:rPr>
+        <w:t>pno</w:t>
+      </w:r>
+      <w:proofErr w:type="spellEnd"/>
+      <w:r>
+        <w:rPr>
+          <w:sz w:val="28"/>
+          <w:szCs w:val="28"/>
+        </w:rPr>
+        <w:t xml:space="preserve"> should be in subquery.</w:t>
       </w:r>
     </w:p>
     <w:sectPr>
@@ -14586,6 +14904,92 @@
     </w:lvl>
   </w:abstractNum>
   <w:abstractNum w:abstractNumId="14" w15:restartNumberingAfterBreak="0">
+    <w:nsid w:val="29EE5563"/>
+    <w:multiLevelType w:val="hybridMultilevel"/>
+    <w:tmpl w:val="1E9A6634"/>
+    <w:lvl w:ilvl="0" w:tplc="40090013">
+      <w:start w:val="1"/>
+      <w:numFmt w:val="upperRoman"/>
+      <w:lvlText w:val="%1."/>
+      <w:lvlJc w:val="right"/>
+      <w:pPr>
+        <w:ind w:left="720" w:hanging="360"/>
+      </w:pPr>
+    </w:lvl>
+    <w:lvl w:ilvl="1" w:tplc="40090019" w:tentative="1">
+      <w:start w:val="1"/>
+      <w:numFmt w:val="lowerLetter"/>
+      <w:lvlText w:val="%2."/>
+      <w:lvlJc w:val="left"/>
+      <w:pPr>
+        <w:ind w:left="1440" w:hanging="360"/>
+      </w:pPr>
+    </w:lvl>
+    <w:lvl w:ilvl="2" w:tplc="4009001B" w:tentative="1">
+      <w:start w:val="1"/>
+      <w:numFmt w:val="lowerRoman"/>
+      <w:lvlText w:val="%3."/>
+      <w:lvlJc w:val="right"/>
+      <w:pPr>
+        <w:ind w:left="2160" w:hanging="180"/>
+      </w:pPr>
+    </w:lvl>
+    <w:lvl w:ilvl="3" w:tplc="4009000F" w:tentative="1">
+      <w:start w:val="1"/>
+      <w:numFmt w:val="decimal"/>
+      <w:lvlText w:val="%4."/>
+      <w:lvlJc w:val="left"/>
+      <w:pPr>
+        <w:ind w:left="2880" w:hanging="360"/>
+      </w:pPr>
+    </w:lvl>
+    <w:lvl w:ilvl="4" w:tplc="40090019" w:tentative="1">
+      <w:start w:val="1"/>
+      <w:numFmt w:val="lowerLetter"/>
+      <w:lvlText w:val="%5."/>
+      <w:lvlJc w:val="left"/>
+      <w:pPr>
+        <w:ind w:left="3600" w:hanging="360"/>
+      </w:pPr>
+    </w:lvl>
+    <w:lvl w:ilvl="5" w:tplc="4009001B" w:tentative="1">
+      <w:start w:val="1"/>
+      <w:numFmt w:val="lowerRoman"/>
+      <w:lvlText w:val="%6."/>
+      <w:lvlJc w:val="right"/>
+      <w:pPr>
+        <w:ind w:left="4320" w:hanging="180"/>
+      </w:pPr>
+    </w:lvl>
+    <w:lvl w:ilvl="6" w:tplc="4009000F" w:tentative="1">
+      <w:start w:val="1"/>
+      <w:numFmt w:val="decimal"/>
+      <w:lvlText w:val="%7."/>
+      <w:lvlJc w:val="left"/>
+      <w:pPr>
+        <w:ind w:left="5040" w:hanging="360"/>
+      </w:pPr>
+    </w:lvl>
+    <w:lvl w:ilvl="7" w:tplc="40090019" w:tentative="1">
+      <w:start w:val="1"/>
+      <w:numFmt w:val="lowerLetter"/>
+      <w:lvlText w:val="%8."/>
+      <w:lvlJc w:val="left"/>
+      <w:pPr>
+        <w:ind w:left="5760" w:hanging="360"/>
+      </w:pPr>
+    </w:lvl>
+    <w:lvl w:ilvl="8" w:tplc="4009001B" w:tentative="1">
+      <w:start w:val="1"/>
+      <w:numFmt w:val="lowerRoman"/>
+      <w:lvlText w:val="%9."/>
+      <w:lvlJc w:val="right"/>
+      <w:pPr>
+        <w:ind w:left="6480" w:hanging="180"/>
+      </w:pPr>
+    </w:lvl>
+  </w:abstractNum>
+  <w:abstractNum w:abstractNumId="15" w15:restartNumberingAfterBreak="0">
     <w:nsid w:val="2C963BCC"/>
     <w:multiLevelType w:val="multilevel"/>
     <w:tmpl w:val="79BA34E0"/>
@@ -14734,7 +15138,7 @@
       </w:rPr>
     </w:lvl>
   </w:abstractNum>
-  <w:abstractNum w:abstractNumId="15" w15:restartNumberingAfterBreak="0">
+  <w:abstractNum w:abstractNumId="16" w15:restartNumberingAfterBreak="0">
     <w:nsid w:val="2D8806CC"/>
     <w:multiLevelType w:val="multilevel"/>
     <w:tmpl w:val="FAD2D89C"/>
@@ -14883,7 +15287,7 @@
       </w:rPr>
     </w:lvl>
   </w:abstractNum>
-  <w:abstractNum w:abstractNumId="16" w15:restartNumberingAfterBreak="0">
+  <w:abstractNum w:abstractNumId="17" w15:restartNumberingAfterBreak="0">
     <w:nsid w:val="30B019CB"/>
     <w:multiLevelType w:val="multilevel"/>
     <w:tmpl w:val="5D8C3420"/>
@@ -15032,7 +15436,7 @@
       </w:rPr>
     </w:lvl>
   </w:abstractNum>
-  <w:abstractNum w:abstractNumId="17" w15:restartNumberingAfterBreak="0">
+  <w:abstractNum w:abstractNumId="18" w15:restartNumberingAfterBreak="0">
     <w:nsid w:val="31E438A1"/>
     <w:multiLevelType w:val="multilevel"/>
     <w:tmpl w:val="837499F4"/>
@@ -15181,7 +15585,7 @@
       </w:rPr>
     </w:lvl>
   </w:abstractNum>
-  <w:abstractNum w:abstractNumId="18" w15:restartNumberingAfterBreak="0">
+  <w:abstractNum w:abstractNumId="19" w15:restartNumberingAfterBreak="0">
     <w:nsid w:val="348B76C1"/>
     <w:multiLevelType w:val="hybridMultilevel"/>
     <w:tmpl w:val="12464518"/>
@@ -15267,7 +15671,7 @@
       </w:pPr>
     </w:lvl>
   </w:abstractNum>
-  <w:abstractNum w:abstractNumId="19" w15:restartNumberingAfterBreak="0">
+  <w:abstractNum w:abstractNumId="20" w15:restartNumberingAfterBreak="0">
     <w:nsid w:val="3ABA3827"/>
     <w:multiLevelType w:val="hybridMultilevel"/>
     <w:tmpl w:val="DB04EACE"/>
@@ -15353,7 +15757,7 @@
       </w:pPr>
     </w:lvl>
   </w:abstractNum>
-  <w:abstractNum w:abstractNumId="20" w15:restartNumberingAfterBreak="0">
+  <w:abstractNum w:abstractNumId="21" w15:restartNumberingAfterBreak="0">
     <w:nsid w:val="3B0500EB"/>
     <w:multiLevelType w:val="multilevel"/>
     <w:tmpl w:val="433CE478"/>
@@ -15498,7 +15902,7 @@
       </w:rPr>
     </w:lvl>
   </w:abstractNum>
-  <w:abstractNum w:abstractNumId="21" w15:restartNumberingAfterBreak="0">
+  <w:abstractNum w:abstractNumId="22" w15:restartNumberingAfterBreak="0">
     <w:nsid w:val="3B29525C"/>
     <w:multiLevelType w:val="multilevel"/>
     <w:tmpl w:val="BD342C52"/>
@@ -15647,7 +16051,7 @@
       </w:rPr>
     </w:lvl>
   </w:abstractNum>
-  <w:abstractNum w:abstractNumId="22" w15:restartNumberingAfterBreak="0">
+  <w:abstractNum w:abstractNumId="23" w15:restartNumberingAfterBreak="0">
     <w:nsid w:val="3FA14EDD"/>
     <w:multiLevelType w:val="hybridMultilevel"/>
     <w:tmpl w:val="91D29AA0"/>
@@ -15733,7 +16137,7 @@
       </w:pPr>
     </w:lvl>
   </w:abstractNum>
-  <w:abstractNum w:abstractNumId="23" w15:restartNumberingAfterBreak="0">
+  <w:abstractNum w:abstractNumId="24" w15:restartNumberingAfterBreak="0">
     <w:nsid w:val="41CB5714"/>
     <w:multiLevelType w:val="hybridMultilevel"/>
     <w:tmpl w:val="5ACE0E38"/>
@@ -15822,7 +16226,7 @@
       </w:pPr>
     </w:lvl>
   </w:abstractNum>
-  <w:abstractNum w:abstractNumId="24" w15:restartNumberingAfterBreak="0">
+  <w:abstractNum w:abstractNumId="25" w15:restartNumberingAfterBreak="0">
     <w:nsid w:val="4910299B"/>
     <w:multiLevelType w:val="hybridMultilevel"/>
     <w:tmpl w:val="505E8358"/>
@@ -15911,7 +16315,7 @@
       </w:pPr>
     </w:lvl>
   </w:abstractNum>
-  <w:abstractNum w:abstractNumId="25" w15:restartNumberingAfterBreak="0">
+  <w:abstractNum w:abstractNumId="26" w15:restartNumberingAfterBreak="0">
     <w:nsid w:val="4C9C522C"/>
     <w:multiLevelType w:val="hybridMultilevel"/>
     <w:tmpl w:val="9CF4E540"/>
@@ -16000,7 +16404,7 @@
       </w:pPr>
     </w:lvl>
   </w:abstractNum>
-  <w:abstractNum w:abstractNumId="26" w15:restartNumberingAfterBreak="0">
+  <w:abstractNum w:abstractNumId="27" w15:restartNumberingAfterBreak="0">
     <w:nsid w:val="4D9C1836"/>
     <w:multiLevelType w:val="multilevel"/>
     <w:tmpl w:val="FF88B6DE"/>
@@ -16149,7 +16553,7 @@
       </w:rPr>
     </w:lvl>
   </w:abstractNum>
-  <w:abstractNum w:abstractNumId="27" w15:restartNumberingAfterBreak="0">
+  <w:abstractNum w:abstractNumId="28" w15:restartNumberingAfterBreak="0">
     <w:nsid w:val="52F00AF7"/>
     <w:multiLevelType w:val="multilevel"/>
     <w:tmpl w:val="D30886D8"/>
@@ -16298,7 +16702,7 @@
       </w:rPr>
     </w:lvl>
   </w:abstractNum>
-  <w:abstractNum w:abstractNumId="28" w15:restartNumberingAfterBreak="0">
+  <w:abstractNum w:abstractNumId="29" w15:restartNumberingAfterBreak="0">
     <w:nsid w:val="54F573AB"/>
     <w:multiLevelType w:val="hybridMultilevel"/>
     <w:tmpl w:val="AC56D67E"/>
@@ -16410,7 +16814,7 @@
       </w:rPr>
     </w:lvl>
   </w:abstractNum>
-  <w:abstractNum w:abstractNumId="29" w15:restartNumberingAfterBreak="0">
+  <w:abstractNum w:abstractNumId="30" w15:restartNumberingAfterBreak="0">
     <w:nsid w:val="5B382BCC"/>
     <w:multiLevelType w:val="multilevel"/>
     <w:tmpl w:val="E92034E6"/>
@@ -16523,7 +16927,7 @@
       </w:pPr>
     </w:lvl>
   </w:abstractNum>
-  <w:abstractNum w:abstractNumId="30" w15:restartNumberingAfterBreak="0">
+  <w:abstractNum w:abstractNumId="31" w15:restartNumberingAfterBreak="0">
     <w:nsid w:val="60643375"/>
     <w:multiLevelType w:val="multilevel"/>
     <w:tmpl w:val="9E1E6100"/>
@@ -16672,7 +17076,7 @@
       </w:rPr>
     </w:lvl>
   </w:abstractNum>
-  <w:abstractNum w:abstractNumId="31" w15:restartNumberingAfterBreak="0">
+  <w:abstractNum w:abstractNumId="32" w15:restartNumberingAfterBreak="0">
     <w:nsid w:val="610849FF"/>
     <w:multiLevelType w:val="hybridMultilevel"/>
     <w:tmpl w:val="55C02BF8"/>
@@ -16762,7 +17166,7 @@
       </w:pPr>
     </w:lvl>
   </w:abstractNum>
-  <w:abstractNum w:abstractNumId="32" w15:restartNumberingAfterBreak="0">
+  <w:abstractNum w:abstractNumId="33" w15:restartNumberingAfterBreak="0">
     <w:nsid w:val="62B46CBE"/>
     <w:multiLevelType w:val="hybridMultilevel"/>
     <w:tmpl w:val="E7B8FE0C"/>
@@ -16874,7 +17278,7 @@
       </w:rPr>
     </w:lvl>
   </w:abstractNum>
-  <w:abstractNum w:abstractNumId="33" w15:restartNumberingAfterBreak="0">
+  <w:abstractNum w:abstractNumId="34" w15:restartNumberingAfterBreak="0">
     <w:nsid w:val="64E87168"/>
     <w:multiLevelType w:val="hybridMultilevel"/>
     <w:tmpl w:val="6E6ED9EC"/>
@@ -16963,7 +17367,7 @@
       </w:pPr>
     </w:lvl>
   </w:abstractNum>
-  <w:abstractNum w:abstractNumId="34" w15:restartNumberingAfterBreak="0">
+  <w:abstractNum w:abstractNumId="35" w15:restartNumberingAfterBreak="0">
     <w:nsid w:val="650943A7"/>
     <w:multiLevelType w:val="hybridMultilevel"/>
     <w:tmpl w:val="645A5F38"/>
@@ -17052,7 +17456,7 @@
       </w:pPr>
     </w:lvl>
   </w:abstractNum>
-  <w:abstractNum w:abstractNumId="35" w15:restartNumberingAfterBreak="0">
+  <w:abstractNum w:abstractNumId="36" w15:restartNumberingAfterBreak="0">
     <w:nsid w:val="67B8422E"/>
     <w:multiLevelType w:val="multilevel"/>
     <w:tmpl w:val="041E6234"/>
@@ -17198,7 +17602,7 @@
       </w:rPr>
     </w:lvl>
   </w:abstractNum>
-  <w:abstractNum w:abstractNumId="36" w15:restartNumberingAfterBreak="0">
+  <w:abstractNum w:abstractNumId="37" w15:restartNumberingAfterBreak="0">
     <w:nsid w:val="6DA059D8"/>
     <w:multiLevelType w:val="hybridMultilevel"/>
     <w:tmpl w:val="41361528"/>
@@ -17287,7 +17691,7 @@
       </w:pPr>
     </w:lvl>
   </w:abstractNum>
-  <w:abstractNum w:abstractNumId="37" w15:restartNumberingAfterBreak="0">
+  <w:abstractNum w:abstractNumId="38" w15:restartNumberingAfterBreak="0">
     <w:nsid w:val="6E8837C6"/>
     <w:multiLevelType w:val="multilevel"/>
     <w:tmpl w:val="A9D4A140"/>
@@ -17436,7 +17840,7 @@
       </w:rPr>
     </w:lvl>
   </w:abstractNum>
-  <w:abstractNum w:abstractNumId="38" w15:restartNumberingAfterBreak="0">
+  <w:abstractNum w:abstractNumId="39" w15:restartNumberingAfterBreak="0">
     <w:nsid w:val="70F25655"/>
     <w:multiLevelType w:val="multilevel"/>
     <w:tmpl w:val="8C94A98C"/>
@@ -17585,7 +17989,7 @@
       </w:rPr>
     </w:lvl>
   </w:abstractNum>
-  <w:abstractNum w:abstractNumId="39" w15:restartNumberingAfterBreak="0">
+  <w:abstractNum w:abstractNumId="40" w15:restartNumberingAfterBreak="0">
     <w:nsid w:val="71313F1D"/>
     <w:multiLevelType w:val="multilevel"/>
     <w:tmpl w:val="FA5E9B7A"/>
@@ -17734,7 +18138,7 @@
       </w:rPr>
     </w:lvl>
   </w:abstractNum>
-  <w:abstractNum w:abstractNumId="40" w15:restartNumberingAfterBreak="0">
+  <w:abstractNum w:abstractNumId="41" w15:restartNumberingAfterBreak="0">
     <w:nsid w:val="717F6C7F"/>
     <w:multiLevelType w:val="hybridMultilevel"/>
     <w:tmpl w:val="F8E07416"/>
@@ -17823,7 +18227,7 @@
       </w:pPr>
     </w:lvl>
   </w:abstractNum>
-  <w:abstractNum w:abstractNumId="41" w15:restartNumberingAfterBreak="0">
+  <w:abstractNum w:abstractNumId="42" w15:restartNumberingAfterBreak="0">
     <w:nsid w:val="732116E7"/>
     <w:multiLevelType w:val="multilevel"/>
     <w:tmpl w:val="C352BCF6"/>
@@ -17972,7 +18376,7 @@
       </w:rPr>
     </w:lvl>
   </w:abstractNum>
-  <w:abstractNum w:abstractNumId="42" w15:restartNumberingAfterBreak="0">
+  <w:abstractNum w:abstractNumId="43" w15:restartNumberingAfterBreak="0">
     <w:nsid w:val="76637F62"/>
     <w:multiLevelType w:val="hybridMultilevel"/>
     <w:tmpl w:val="9A9837A2"/>
@@ -18061,7 +18465,7 @@
       </w:pPr>
     </w:lvl>
   </w:abstractNum>
-  <w:abstractNum w:abstractNumId="43" w15:restartNumberingAfterBreak="0">
+  <w:abstractNum w:abstractNumId="44" w15:restartNumberingAfterBreak="0">
     <w:nsid w:val="769B769C"/>
     <w:multiLevelType w:val="multilevel"/>
     <w:tmpl w:val="32F4216E"/>
@@ -18210,7 +18614,7 @@
       </w:rPr>
     </w:lvl>
   </w:abstractNum>
-  <w:abstractNum w:abstractNumId="44" w15:restartNumberingAfterBreak="0">
+  <w:abstractNum w:abstractNumId="45" w15:restartNumberingAfterBreak="0">
     <w:nsid w:val="79601C6D"/>
     <w:multiLevelType w:val="multilevel"/>
     <w:tmpl w:val="78002C54"/>
@@ -18323,7 +18727,7 @@
       </w:pPr>
     </w:lvl>
   </w:abstractNum>
-  <w:abstractNum w:abstractNumId="45" w15:restartNumberingAfterBreak="0">
+  <w:abstractNum w:abstractNumId="46" w15:restartNumberingAfterBreak="0">
     <w:nsid w:val="7BF407E3"/>
     <w:multiLevelType w:val="multilevel"/>
     <w:tmpl w:val="9A74D01E"/>
@@ -18472,7 +18876,7 @@
       </w:rPr>
     </w:lvl>
   </w:abstractNum>
-  <w:abstractNum w:abstractNumId="46" w15:restartNumberingAfterBreak="0">
+  <w:abstractNum w:abstractNumId="47" w15:restartNumberingAfterBreak="0">
     <w:nsid w:val="7D823498"/>
     <w:multiLevelType w:val="multilevel"/>
     <w:tmpl w:val="E9446EE8"/>
@@ -18621,7 +19025,7 @@
       </w:rPr>
     </w:lvl>
   </w:abstractNum>
-  <w:abstractNum w:abstractNumId="47" w15:restartNumberingAfterBreak="0">
+  <w:abstractNum w:abstractNumId="48" w15:restartNumberingAfterBreak="0">
     <w:nsid w:val="7EDB69E2"/>
     <w:multiLevelType w:val="multilevel"/>
     <w:tmpl w:val="AD46CEC2"/>
@@ -18774,133 +19178,133 @@
     <w:abstractNumId w:val="13"/>
   </w:num>
   <w:num w:numId="2" w16cid:durableId="999424346">
-    <w:abstractNumId w:val="27"/>
+    <w:abstractNumId w:val="28"/>
   </w:num>
   <w:num w:numId="3" w16cid:durableId="1325819858">
-    <w:abstractNumId w:val="29"/>
+    <w:abstractNumId w:val="30"/>
   </w:num>
   <w:num w:numId="4" w16cid:durableId="133182302">
     <w:abstractNumId w:val="3"/>
   </w:num>
   <w:num w:numId="5" w16cid:durableId="1477799212">
-    <w:abstractNumId w:val="32"/>
+    <w:abstractNumId w:val="33"/>
   </w:num>
   <w:num w:numId="6" w16cid:durableId="1507357191">
-    <w:abstractNumId w:val="28"/>
+    <w:abstractNumId w:val="29"/>
   </w:num>
   <w:num w:numId="7" w16cid:durableId="1234849977">
-    <w:abstractNumId w:val="36"/>
+    <w:abstractNumId w:val="37"/>
   </w:num>
   <w:num w:numId="8" w16cid:durableId="2095319065">
-    <w:abstractNumId w:val="25"/>
+    <w:abstractNumId w:val="26"/>
   </w:num>
   <w:num w:numId="9" w16cid:durableId="1276062488">
-    <w:abstractNumId w:val="40"/>
+    <w:abstractNumId w:val="41"/>
   </w:num>
   <w:num w:numId="10" w16cid:durableId="301732449">
-    <w:abstractNumId w:val="42"/>
+    <w:abstractNumId w:val="43"/>
   </w:num>
   <w:num w:numId="11" w16cid:durableId="565268006">
-    <w:abstractNumId w:val="33"/>
+    <w:abstractNumId w:val="34"/>
   </w:num>
   <w:num w:numId="12" w16cid:durableId="1765566125">
     <w:abstractNumId w:val="8"/>
   </w:num>
   <w:num w:numId="13" w16cid:durableId="1685395611">
-    <w:abstractNumId w:val="24"/>
+    <w:abstractNumId w:val="25"/>
   </w:num>
   <w:num w:numId="14" w16cid:durableId="371853232">
     <w:abstractNumId w:val="12"/>
   </w:num>
   <w:num w:numId="15" w16cid:durableId="1233125880">
-    <w:abstractNumId w:val="22"/>
+    <w:abstractNumId w:val="23"/>
   </w:num>
   <w:num w:numId="16" w16cid:durableId="1600603824">
-    <w:abstractNumId w:val="30"/>
+    <w:abstractNumId w:val="31"/>
   </w:num>
   <w:num w:numId="17" w16cid:durableId="1336306445">
     <w:abstractNumId w:val="6"/>
   </w:num>
   <w:num w:numId="18" w16cid:durableId="1924684374">
-    <w:abstractNumId w:val="14"/>
+    <w:abstractNumId w:val="15"/>
   </w:num>
   <w:num w:numId="19" w16cid:durableId="210307738">
-    <w:abstractNumId w:val="39"/>
+    <w:abstractNumId w:val="40"/>
   </w:num>
   <w:num w:numId="20" w16cid:durableId="1427000618">
-    <w:abstractNumId w:val="37"/>
+    <w:abstractNumId w:val="38"/>
   </w:num>
   <w:num w:numId="21" w16cid:durableId="853761629">
     <w:abstractNumId w:val="0"/>
   </w:num>
   <w:num w:numId="22" w16cid:durableId="1388920533">
-    <w:abstractNumId w:val="41"/>
+    <w:abstractNumId w:val="42"/>
   </w:num>
   <w:num w:numId="23" w16cid:durableId="278532805">
-    <w:abstractNumId w:val="44"/>
+    <w:abstractNumId w:val="45"/>
   </w:num>
   <w:num w:numId="24" w16cid:durableId="76437811">
-    <w:abstractNumId w:val="26"/>
+    <w:abstractNumId w:val="27"/>
   </w:num>
   <w:num w:numId="25" w16cid:durableId="49349885">
-    <w:abstractNumId w:val="16"/>
+    <w:abstractNumId w:val="17"/>
   </w:num>
   <w:num w:numId="26" w16cid:durableId="1078861533">
     <w:abstractNumId w:val="1"/>
   </w:num>
   <w:num w:numId="27" w16cid:durableId="1645961168">
-    <w:abstractNumId w:val="21"/>
+    <w:abstractNumId w:val="22"/>
   </w:num>
   <w:num w:numId="28" w16cid:durableId="538661812">
     <w:abstractNumId w:val="2"/>
   </w:num>
   <w:num w:numId="29" w16cid:durableId="2143110771">
-    <w:abstractNumId w:val="43"/>
+    <w:abstractNumId w:val="44"/>
   </w:num>
   <w:num w:numId="30" w16cid:durableId="20129419">
-    <w:abstractNumId w:val="38"/>
+    <w:abstractNumId w:val="39"/>
   </w:num>
   <w:num w:numId="31" w16cid:durableId="1258295610">
-    <w:abstractNumId w:val="35"/>
+    <w:abstractNumId w:val="36"/>
   </w:num>
   <w:num w:numId="32" w16cid:durableId="1966346223">
     <w:abstractNumId w:val="7"/>
   </w:num>
   <w:num w:numId="33" w16cid:durableId="219757389">
+    <w:abstractNumId w:val="47"/>
+  </w:num>
+  <w:num w:numId="34" w16cid:durableId="1441219298">
+    <w:abstractNumId w:val="18"/>
+  </w:num>
+  <w:num w:numId="35" w16cid:durableId="993533201">
+    <w:abstractNumId w:val="16"/>
+  </w:num>
+  <w:num w:numId="36" w16cid:durableId="2136486854">
+    <w:abstractNumId w:val="21"/>
+  </w:num>
+  <w:num w:numId="37" w16cid:durableId="1370228645">
+    <w:abstractNumId w:val="48"/>
+  </w:num>
+  <w:num w:numId="38" w16cid:durableId="1445344642">
     <w:abstractNumId w:val="46"/>
   </w:num>
-  <w:num w:numId="34" w16cid:durableId="1441219298">
-    <w:abstractNumId w:val="17"/>
-  </w:num>
-  <w:num w:numId="35" w16cid:durableId="993533201">
-    <w:abstractNumId w:val="15"/>
-  </w:num>
-  <w:num w:numId="36" w16cid:durableId="2136486854">
-    <w:abstractNumId w:val="20"/>
-  </w:num>
-  <w:num w:numId="37" w16cid:durableId="1370228645">
-    <w:abstractNumId w:val="47"/>
-  </w:num>
-  <w:num w:numId="38" w16cid:durableId="1445344642">
-    <w:abstractNumId w:val="45"/>
-  </w:num>
   <w:num w:numId="39" w16cid:durableId="1738094195">
-    <w:abstractNumId w:val="31"/>
+    <w:abstractNumId w:val="32"/>
   </w:num>
   <w:num w:numId="40" w16cid:durableId="1354649103">
     <w:abstractNumId w:val="4"/>
   </w:num>
   <w:num w:numId="41" w16cid:durableId="1829319484">
-    <w:abstractNumId w:val="34"/>
+    <w:abstractNumId w:val="35"/>
   </w:num>
   <w:num w:numId="42" w16cid:durableId="1204514837">
-    <w:abstractNumId w:val="18"/>
+    <w:abstractNumId w:val="19"/>
   </w:num>
   <w:num w:numId="43" w16cid:durableId="1054308977">
     <w:abstractNumId w:val="9"/>
   </w:num>
   <w:num w:numId="44" w16cid:durableId="1027213973">
-    <w:abstractNumId w:val="28"/>
+    <w:abstractNumId w:val="29"/>
   </w:num>
   <w:num w:numId="45" w16cid:durableId="268700062">
     <w:abstractNumId w:val="11"/>
@@ -18909,13 +19313,16 @@
     <w:abstractNumId w:val="10"/>
   </w:num>
   <w:num w:numId="47" w16cid:durableId="855466501">
-    <w:abstractNumId w:val="23"/>
+    <w:abstractNumId w:val="24"/>
   </w:num>
   <w:num w:numId="48" w16cid:durableId="249507407">
-    <w:abstractNumId w:val="19"/>
+    <w:abstractNumId w:val="20"/>
   </w:num>
   <w:num w:numId="49" w16cid:durableId="720596902">
     <w:abstractNumId w:val="5"/>
+  </w:num>
+  <w:num w:numId="50" w16cid:durableId="839274448">
+    <w:abstractNumId w:val="14"/>
   </w:num>
 </w:numbering>
 </file>

</xml_diff>